<commit_message>
feat: add script to generate revised proposal document and update project files
</commit_message>
<xml_diff>
--- a/Proposal.docx
+++ b/Proposal.docx
@@ -5,7 +5,7 @@
     <w:p>
       <w:pPr>
         <w:rPr>
-          <w:rFonts w:ascii="Agency FB" w:hAnsi="Agency FB" w:cs="Arial"/>
+          <w:rFonts w:ascii="Arial" w:hAnsi="Arial" w:cs="Arial"/>
           <w:b/>
           <w:bCs/>
           <w:sz w:val="24"/>
@@ -14,7 +14,7 @@
       </w:pPr>
       <w:r>
         <w:rPr>
-          <w:rFonts w:ascii="Agency FB" w:hAnsi="Agency FB" w:cs="Arial"/>
+          <w:rFonts w:ascii="Arial" w:hAnsi="Arial" w:cs="Arial"/>
           <w:b/>
           <w:bCs/>
           <w:sz w:val="24"/>
@@ -26,42 +26,22 @@
     <w:p>
       <w:pPr>
         <w:rPr>
-          <w:rFonts w:ascii="Agency FB" w:hAnsi="Agency FB" w:cs="Arial"/>
-          <w:b/>
-          <w:bCs/>
-          <w:sz w:val="72"/>
-          <w:szCs w:val="72"/>
-        </w:rPr>
-      </w:pPr>
-      <w:r>
-        <w:rPr>
-          <w:rFonts w:ascii="Agency FB" w:hAnsi="Agency FB" w:cs="Arial"/>
-          <w:b/>
-          <w:bCs/>
-          <w:sz w:val="72"/>
-          <w:szCs w:val="72"/>
-        </w:rPr>
-        <w:t xml:space="preserve">Mitigating "Lag-to-Churn": An AI-Driven Edge </w:t>
-      </w:r>
-      <w:r>
-        <w:rPr>
-          <w:rFonts w:ascii="Agency FB" w:hAnsi="Agency FB" w:cs="Arial"/>
-          <w:b/>
-          <w:bCs/>
-          <w:sz w:val="72"/>
-          <w:szCs w:val="72"/>
-        </w:rPr>
-        <w:t>Defence</w:t>
-      </w:r>
-      <w:r>
-        <w:rPr>
-          <w:rFonts w:ascii="Agency FB" w:hAnsi="Agency FB" w:cs="Arial"/>
-          <w:b/>
-          <w:bCs/>
-          <w:sz w:val="72"/>
-          <w:szCs w:val="72"/>
-        </w:rPr>
-        <w:t xml:space="preserve"> Framework Against DDoS Attacks in the Gaming Industry</w:t>
+          <w:rFonts w:ascii="Arial" w:hAnsi="Arial" w:cs="Arial"/>
+          <w:b/>
+          <w:bCs/>
+          <w:sz w:val="56"/>
+          <w:szCs w:val="56"/>
+        </w:rPr>
+      </w:pPr>
+      <w:r>
+        <w:rPr>
+          <w:rFonts w:ascii="Arial" w:hAnsi="Arial" w:cs="Arial"/>
+          <w:b/>
+          <w:bCs/>
+          <w:sz w:val="56"/>
+          <w:szCs w:val="56"/>
+        </w:rPr>
+        <w:t>Mitigating "Lag-to-Churn": An AI-Driven Edge Defence Framework Against DDoS Attacks in the Gaming Industry</w:t>
       </w:r>
     </w:p>
     <w:p>
@@ -96,17 +76,7 @@
           <w:sz w:val="28"/>
           <w:szCs w:val="28"/>
         </w:rPr>
-        <w:t xml:space="preserve">        -</w:t>
-      </w:r>
-      <w:r>
-        <w:rPr>
-          <w:rFonts w:ascii="Arial" w:hAnsi="Arial" w:cs="Arial"/>
-          <w:b/>
-          <w:bCs/>
-          <w:sz w:val="28"/>
-          <w:szCs w:val="28"/>
-        </w:rPr>
-        <w:t>By Uday Vachasiddha</w:t>
+        <w:t xml:space="preserve">        -By Uday Vachasiddha</w:t>
       </w:r>
     </w:p>
     <w:p>
@@ -325,6 +295,30 @@
       <w:pPr>
         <w:rPr>
           <w:rFonts w:ascii="Arial" w:hAnsi="Arial" w:cs="Arial"/>
+          <w:b/>
+          <w:bCs/>
+          <w:sz w:val="28"/>
+          <w:szCs w:val="28"/>
+          <w:u w:val="single"/>
+        </w:rPr>
+      </w:pPr>
+    </w:p>
+    <w:p>
+      <w:pPr>
+        <w:rPr>
+          <w:rFonts w:ascii="Arial" w:hAnsi="Arial" w:cs="Arial"/>
+          <w:b/>
+          <w:bCs/>
+          <w:sz w:val="28"/>
+          <w:szCs w:val="28"/>
+          <w:u w:val="single"/>
+        </w:rPr>
+      </w:pPr>
+    </w:p>
+    <w:p>
+      <w:pPr>
+        <w:rPr>
+          <w:rFonts w:ascii="Arial" w:hAnsi="Arial" w:cs="Arial"/>
           <w:sz w:val="24"/>
           <w:szCs w:val="24"/>
         </w:rPr>
@@ -351,7 +345,7 @@
         <w:rPr>
           <w:rFonts w:ascii="Arial" w:hAnsi="Arial" w:cs="Arial"/>
         </w:rPr>
-        <w:t>The modern gaming industry relies heavily on "Games as a Service" (</w:t>
+        <w:t>"Games as a Service" (</w:t>
       </w:r>
       <w:proofErr w:type="spellStart"/>
       <w:r>
@@ -365,20 +359,7 @@
         <w:rPr>
           <w:rFonts w:ascii="Arial" w:hAnsi="Arial" w:cs="Arial"/>
         </w:rPr>
-        <w:t>) models, where real-time performance and continuous availability are critical to revenue. Unlike traditional web applications, multiplayer games operate in highly sensitive network environments where even a two-second delay (lag) can ruin the user experience.</w:t>
-      </w:r>
-    </w:p>
-    <w:p>
-      <w:pPr>
-        <w:rPr>
-          <w:rFonts w:ascii="Arial" w:hAnsi="Arial" w:cs="Arial"/>
-        </w:rPr>
-      </w:pPr>
-      <w:r>
-        <w:rPr>
-          <w:rFonts w:ascii="Arial" w:hAnsi="Arial" w:cs="Arial"/>
-        </w:rPr>
-        <w:t>Although the industry has advanced in graphics and mechanics, it remains highly vulnerable to Distributed Denial of Service (DDoS) attacks. The democratization of cybercrime, specifically the rise of "DDoS-as-a-Service," allows malicious actors to launch volumetric and application-layer attacks with ease. These attacks cause severe server instability, leading directly to player frustration, churn, and massive financial losses for game studios.</w:t>
+        <w:t>) business models are gaining popularity in the gaming industry where revenue and revenue growth are tied to real-time responsiveness and availability. Multiplayer games operate in a network environment where there can be no network lag (two seconds) and millisecond responsiveness is key to the gaming experience. Even with levels of game graphics and game play improving, the industry remains extremely vulnerable to Distributed Denial of Service (DDoS) attacks. Criminal commoditization, specifically "DDoS-as-a-Service", results in volumetric and application layer DDoS attacks becoming accessible to all. This instability to the game's servers creates dissatisfied players, churn and lost revenue for the game's developer.</w:t>
       </w:r>
     </w:p>
     <w:p>
@@ -417,103 +398,125 @@
         <w:rPr>
           <w:rFonts w:ascii="Arial" w:hAnsi="Arial" w:cs="Arial"/>
         </w:rPr>
-        <w:t>Service downtime and high latency in gaming usually result from malicious traffic overwhelming core servers.</w:t>
-      </w:r>
-    </w:p>
-    <w:p>
-      <w:pPr>
-        <w:rPr>
-          <w:rFonts w:ascii="Arial" w:hAnsi="Arial" w:cs="Arial"/>
-        </w:rPr>
-      </w:pPr>
-      <w:r>
-        <w:rPr>
-          <w:rFonts w:ascii="Arial" w:hAnsi="Arial" w:cs="Arial"/>
-        </w:rPr>
-        <w:t>However, most existing traditional DDoS mitigation tools route traffic to centralized "scrubbing centers." While effective for standard websites, this rerouting adds significant latency (ping) that makes real-time gaming unplayable.</w:t>
-      </w:r>
-    </w:p>
-    <w:p>
-      <w:pPr>
-        <w:rPr>
-          <w:rFonts w:ascii="Arial" w:hAnsi="Arial" w:cs="Arial"/>
-        </w:rPr>
-      </w:pPr>
-      <w:r>
-        <w:rPr>
-          <w:rFonts w:ascii="Arial" w:hAnsi="Arial" w:cs="Arial"/>
-        </w:rPr>
-        <w:t>Currently, there is a critical need for a decentralized security system specifically optimized for gaming that can:</w:t>
-      </w:r>
-    </w:p>
-    <w:p>
-      <w:pPr>
+        <w:t xml:space="preserve">The downtime and latency of gaming services is often due to a flood of traffic to gaming systems. </w:t>
+      </w:r>
+    </w:p>
+    <w:p>
+      <w:pPr>
+        <w:rPr>
+          <w:rFonts w:ascii="Arial" w:hAnsi="Arial" w:cs="Arial"/>
+        </w:rPr>
+      </w:pPr>
+      <w:r>
+        <w:rPr>
+          <w:rFonts w:ascii="Arial" w:hAnsi="Arial" w:cs="Arial"/>
+        </w:rPr>
+        <w:t>However, conventional DDoS detection and mitigation services reroute traffic to a "scrubbing (cleaning) facility". This is suitable for websites, but will increase ping (latency), and makes gaming impossible.</w:t>
+      </w:r>
+    </w:p>
+    <w:p>
+      <w:pPr>
+        <w:rPr>
+          <w:rFonts w:ascii="Arial" w:hAnsi="Arial" w:cs="Arial"/>
+        </w:rPr>
+      </w:pPr>
+      <w:r>
+        <w:rPr>
+          <w:rFonts w:ascii="Arial" w:hAnsi="Arial" w:cs="Arial"/>
+        </w:rPr>
+        <w:t>Currently there is a need for a distributed security mechanism that is specifically designed for gaming and can</w:t>
+      </w:r>
+      <w:r>
+        <w:rPr>
+          <w:rFonts w:ascii="Arial" w:hAnsi="Arial" w:cs="Arial"/>
+        </w:rPr>
+        <w:t>:</w:t>
+      </w:r>
+    </w:p>
+    <w:p>
+      <w:pPr>
+        <w:pStyle w:val="NormalWeb"/>
         <w:numPr>
           <w:ilvl w:val="0"/>
           <w:numId w:val="1"/>
         </w:numPr>
-        <w:rPr>
-          <w:rFonts w:ascii="Arial" w:hAnsi="Arial" w:cs="Arial"/>
-        </w:rPr>
-      </w:pPr>
-      <w:r>
-        <w:rPr>
-          <w:rFonts w:ascii="Arial" w:hAnsi="Arial" w:cs="Arial"/>
-        </w:rPr>
-        <w:t>Filter malicious packets in milliseconds without routing traffic away from the game server.</w:t>
-      </w:r>
-    </w:p>
-    <w:p>
-      <w:pPr>
+        <w:spacing w:after="240" w:afterAutospacing="0"/>
+        <w:rPr>
+          <w:rFonts w:ascii="Arial" w:hAnsi="Arial" w:cs="Arial"/>
+          <w:sz w:val="22"/>
+          <w:szCs w:val="22"/>
+        </w:rPr>
+      </w:pPr>
+      <w:r>
+        <w:rPr>
+          <w:rFonts w:ascii="Arial" w:hAnsi="Arial" w:cs="Arial"/>
+          <w:sz w:val="22"/>
+          <w:szCs w:val="22"/>
+        </w:rPr>
+        <w:t xml:space="preserve">Filter out bad packets in just milliseconds without taking the traffic away from server. </w:t>
+      </w:r>
+    </w:p>
+    <w:p>
+      <w:pPr>
+        <w:pStyle w:val="NormalWeb"/>
         <w:numPr>
           <w:ilvl w:val="0"/>
           <w:numId w:val="1"/>
         </w:numPr>
-        <w:rPr>
-          <w:rFonts w:ascii="Arial" w:hAnsi="Arial" w:cs="Arial"/>
-        </w:rPr>
-      </w:pPr>
-      <w:r>
-        <w:rPr>
-          <w:rFonts w:ascii="Arial" w:hAnsi="Arial" w:cs="Arial"/>
-        </w:rPr>
-        <w:t>Differentiate between legitimate player actions and sophisticated botnet traffic.</w:t>
-      </w:r>
-    </w:p>
-    <w:p>
-      <w:pPr>
+        <w:spacing w:after="240" w:afterAutospacing="0"/>
+        <w:rPr>
+          <w:rFonts w:ascii="Arial" w:hAnsi="Arial" w:cs="Arial"/>
+          <w:sz w:val="22"/>
+          <w:szCs w:val="22"/>
+        </w:rPr>
+      </w:pPr>
+      <w:r>
+        <w:rPr>
+          <w:rFonts w:ascii="Arial" w:hAnsi="Arial" w:cs="Arial"/>
+          <w:sz w:val="22"/>
+          <w:szCs w:val="22"/>
+        </w:rPr>
+        <w:t>Identify complex botnets from legitimate play.</w:t>
+      </w:r>
+    </w:p>
+    <w:p>
+      <w:pPr>
+        <w:pStyle w:val="NormalWeb"/>
         <w:numPr>
           <w:ilvl w:val="0"/>
           <w:numId w:val="1"/>
         </w:numPr>
         <w:rPr>
           <w:rFonts w:ascii="Arial" w:hAnsi="Arial" w:cs="Arial"/>
-        </w:rPr>
-      </w:pPr>
-      <w:r>
-        <w:rPr>
-          <w:rFonts w:ascii="Arial" w:hAnsi="Arial" w:cs="Arial"/>
-        </w:rPr>
-        <w:t>Operate directly at the network edge to neutralize attacks before they consume core server CPU.</w:t>
-      </w:r>
-    </w:p>
-    <w:p>
-      <w:pPr>
-        <w:rPr>
-          <w:rFonts w:ascii="Arial" w:hAnsi="Arial" w:cs="Arial"/>
-        </w:rPr>
-      </w:pPr>
-      <w:r>
-        <w:rPr>
-          <w:rFonts w:ascii="Arial" w:hAnsi="Arial" w:cs="Arial"/>
-        </w:rPr>
-        <w:t>This gap motivates the development of an AI-enhanced, edge-based predictive mitigation system that protects both service availability and player retention.</w:t>
-      </w:r>
-      <w:r>
-        <w:rPr>
-          <w:rFonts w:ascii="Arial" w:hAnsi="Arial" w:cs="Arial"/>
-        </w:rPr>
-        <w:tab/>
+          <w:sz w:val="22"/>
+          <w:szCs w:val="22"/>
+        </w:rPr>
+      </w:pPr>
+      <w:r>
+        <w:rPr>
+          <w:rFonts w:ascii="Arial" w:hAnsi="Arial" w:cs="Arial"/>
+          <w:sz w:val="22"/>
+          <w:szCs w:val="22"/>
+        </w:rPr>
+        <w:t>Act on the edge to prevent attacks from saturating the game server.</w:t>
+      </w:r>
+    </w:p>
+    <w:p>
+      <w:pPr>
+        <w:pStyle w:val="NormalWeb"/>
+        <w:rPr>
+          <w:rFonts w:ascii="Arial" w:hAnsi="Arial" w:cs="Arial"/>
+          <w:sz w:val="22"/>
+          <w:szCs w:val="22"/>
+        </w:rPr>
+      </w:pPr>
+      <w:r>
+        <w:rPr>
+          <w:rFonts w:ascii="Arial" w:hAnsi="Arial" w:cs="Arial"/>
+          <w:sz w:val="22"/>
+          <w:szCs w:val="22"/>
+        </w:rPr>
+        <w:t>This results in the development of a machine intelligence based predictive, edge-based mitigation engine to protect against service downtime and player churn.</w:t>
       </w:r>
     </w:p>
     <w:p>
@@ -552,46 +555,41 @@
         <w:rPr>
           <w:rFonts w:ascii="Arial" w:hAnsi="Arial" w:cs="Arial"/>
         </w:rPr>
-        <w:t>Machine learning has been widely applied in network anomaly detection, and technologies like eBPF (Extended Berkeley Packet Filter) have revolutionized high-speed packet processing.</w:t>
-      </w:r>
-    </w:p>
-    <w:p>
-      <w:pPr>
-        <w:rPr>
-          <w:rFonts w:ascii="Arial" w:hAnsi="Arial" w:cs="Arial"/>
-        </w:rPr>
-      </w:pPr>
-      <w:r>
-        <w:rPr>
-          <w:rFonts w:ascii="Arial" w:hAnsi="Arial" w:cs="Arial"/>
-        </w:rPr>
-        <w:t>However, these approaches are often researched in isolated corporate or web-hosting environments rather than high-stakes, UDP-heavy gaming networks. There is limited research on integrating lightweight machine learning algorithms directly with kernel-level packet filtering at the network edge to maintain the strict &lt;20ms latency required by competitive gaming.</w:t>
-      </w:r>
-    </w:p>
-    <w:p>
-      <w:pPr>
-        <w:rPr>
-          <w:rFonts w:ascii="Arial" w:hAnsi="Arial" w:cs="Arial"/>
-        </w:rPr>
-      </w:pPr>
-      <w:r>
-        <w:rPr>
-          <w:rFonts w:ascii="Arial" w:hAnsi="Arial" w:cs="Arial"/>
-        </w:rPr>
-        <w:t xml:space="preserve">This project aims to address this gap by developing a hybrid framework that uses AI to baseline player </w:t>
-      </w:r>
-      <w:r>
-        <w:rPr>
-          <w:rFonts w:ascii="Arial" w:hAnsi="Arial" w:cs="Arial"/>
-        </w:rPr>
-        <w:t>behaviour</w:t>
-      </w:r>
-      <w:r>
-        <w:rPr>
-          <w:rFonts w:ascii="Arial" w:hAnsi="Arial" w:cs="Arial"/>
-        </w:rPr>
-        <w:t xml:space="preserve"> and eBPF to execute instantaneous packet drops at the edge.</w:t>
-      </w:r>
+        <w:t>Machine learning approaches have been widely applied for network intrusion detection and fast packet processing techniques such as eBPF (Extended Berkeley Packet Filter) has been proposed.</w:t>
+      </w:r>
+    </w:p>
+    <w:p>
+      <w:pPr>
+        <w:rPr>
+          <w:rFonts w:ascii="Arial" w:hAnsi="Arial" w:cs="Arial"/>
+        </w:rPr>
+      </w:pPr>
+      <w:r>
+        <w:rPr>
+          <w:rFonts w:ascii="Arial" w:hAnsi="Arial" w:cs="Arial"/>
+        </w:rPr>
+        <w:t xml:space="preserve">However, this work is performed primarily in closed corporate, or web-hosting network settings with a latency of less than 20ms, rather than in competitive games with UDP-based data flows. And there is little research about how to use lightweight machine learning algorithms and edge-based kernel level packet drops to keep the low latency required for online gaming (&lt; 20ms). </w:t>
+      </w:r>
+    </w:p>
+    <w:p>
+      <w:pPr>
+        <w:rPr>
+          <w:rFonts w:ascii="Arial" w:hAnsi="Arial" w:cs="Arial"/>
+        </w:rPr>
+      </w:pPr>
+      <w:r>
+        <w:rPr>
+          <w:rFonts w:ascii="Arial" w:hAnsi="Arial" w:cs="Arial"/>
+        </w:rPr>
+        <w:t xml:space="preserve">This project will address this gap by developing a hybrid approach to baseline player behaviours with AI, and real-time packet dropping device using eBPF at the network edge. </w:t>
+      </w:r>
+    </w:p>
+    <w:p>
+      <w:pPr>
+        <w:rPr>
+          <w:rFonts w:ascii="Arial" w:hAnsi="Arial" w:cs="Arial"/>
+        </w:rPr>
+      </w:pPr>
     </w:p>
     <w:p>
       <w:pPr>
@@ -623,7 +621,6 @@
           <w:sz w:val="24"/>
           <w:szCs w:val="24"/>
         </w:rPr>
-        <w:lastRenderedPageBreak/>
         <w:t>4. Scope:</w:t>
       </w:r>
     </w:p>
@@ -637,88 +634,107 @@
         <w:rPr>
           <w:rFonts w:ascii="Arial" w:hAnsi="Arial" w:cs="Arial"/>
         </w:rPr>
-        <w:t>This project aims to design and implement a simulated edge-</w:t>
-      </w:r>
-      <w:r>
-        <w:rPr>
-          <w:rFonts w:ascii="Arial" w:hAnsi="Arial" w:cs="Arial"/>
-        </w:rPr>
-        <w:t>defence</w:t>
-      </w:r>
-      <w:r>
-        <w:rPr>
-          <w:rFonts w:ascii="Arial" w:hAnsi="Arial" w:cs="Arial"/>
-        </w:rPr>
-        <w:t xml:space="preserve"> network that:</w:t>
-      </w:r>
-    </w:p>
-    <w:p>
-      <w:pPr>
+        <w:t>This project will construct a prototype edge-defence system which:</w:t>
+      </w:r>
+    </w:p>
+    <w:p>
+      <w:pPr>
+        <w:pStyle w:val="NormalWeb"/>
         <w:numPr>
           <w:ilvl w:val="0"/>
           <w:numId w:val="2"/>
         </w:numPr>
-        <w:rPr>
-          <w:rFonts w:ascii="Arial" w:hAnsi="Arial" w:cs="Arial"/>
-        </w:rPr>
-      </w:pPr>
-      <w:r>
-        <w:rPr>
-          <w:rFonts w:ascii="Arial" w:hAnsi="Arial" w:cs="Arial"/>
-        </w:rPr>
-        <w:t>Integrates Cloudflare's Anycast routing to simulate global traffic distribution.</w:t>
-      </w:r>
-    </w:p>
-    <w:p>
-      <w:pPr>
+        <w:spacing w:after="240" w:afterAutospacing="0"/>
+        <w:rPr>
+          <w:rFonts w:ascii="Arial" w:hAnsi="Arial" w:cs="Arial"/>
+          <w:sz w:val="22"/>
+          <w:szCs w:val="22"/>
+        </w:rPr>
+      </w:pPr>
+      <w:r>
+        <w:rPr>
+          <w:rFonts w:ascii="Arial" w:hAnsi="Arial" w:cs="Arial"/>
+          <w:sz w:val="22"/>
+          <w:szCs w:val="22"/>
+        </w:rPr>
+        <w:t>Emulates a global Anycast network using Cloudflare's Anycast.</w:t>
+      </w:r>
+    </w:p>
+    <w:p>
+      <w:pPr>
+        <w:pStyle w:val="NormalWeb"/>
         <w:numPr>
           <w:ilvl w:val="0"/>
           <w:numId w:val="2"/>
         </w:numPr>
-        <w:rPr>
-          <w:rFonts w:ascii="Arial" w:hAnsi="Arial" w:cs="Arial"/>
-        </w:rPr>
-      </w:pPr>
-      <w:r>
-        <w:rPr>
-          <w:rFonts w:ascii="Arial" w:hAnsi="Arial" w:cs="Arial"/>
-        </w:rPr>
-        <w:t>Predicts and identifies malicious DDoS packets using LightGBM and Random Forest algorithms.</w:t>
-      </w:r>
-    </w:p>
-    <w:p>
-      <w:pPr>
+        <w:spacing w:after="240" w:afterAutospacing="0"/>
+        <w:rPr>
+          <w:rFonts w:ascii="Arial" w:hAnsi="Arial" w:cs="Arial"/>
+          <w:sz w:val="22"/>
+          <w:szCs w:val="22"/>
+        </w:rPr>
+      </w:pPr>
+      <w:r>
+        <w:rPr>
+          <w:rFonts w:ascii="Arial" w:hAnsi="Arial" w:cs="Arial"/>
+          <w:sz w:val="22"/>
+          <w:szCs w:val="22"/>
+        </w:rPr>
+        <w:t xml:space="preserve">Detects malicious packets of DDoS attack with LightGBM and Random Forest. </w:t>
+      </w:r>
+    </w:p>
+    <w:p>
+      <w:pPr>
+        <w:pStyle w:val="NormalWeb"/>
         <w:numPr>
           <w:ilvl w:val="0"/>
           <w:numId w:val="2"/>
         </w:numPr>
-        <w:rPr>
-          <w:rFonts w:ascii="Arial" w:hAnsi="Arial" w:cs="Arial"/>
-        </w:rPr>
-      </w:pPr>
-      <w:r>
-        <w:rPr>
-          <w:rFonts w:ascii="Arial" w:hAnsi="Arial" w:cs="Arial"/>
-        </w:rPr>
-        <w:t>Drops malicious traffic at the kernel level using eBPF/XDP.</w:t>
-      </w:r>
-    </w:p>
-    <w:p>
-      <w:pPr>
+        <w:spacing w:after="240" w:afterAutospacing="0"/>
+        <w:rPr>
+          <w:rFonts w:ascii="Arial" w:hAnsi="Arial" w:cs="Arial"/>
+          <w:sz w:val="22"/>
+          <w:szCs w:val="22"/>
+        </w:rPr>
+      </w:pPr>
+      <w:r>
+        <w:rPr>
+          <w:rFonts w:ascii="Arial" w:hAnsi="Arial" w:cs="Arial"/>
+          <w:sz w:val="22"/>
+          <w:szCs w:val="22"/>
+        </w:rPr>
+        <w:t xml:space="preserve">Will drop malicious packets in the kernel with eBPF/XDP. </w:t>
+      </w:r>
+    </w:p>
+    <w:p>
+      <w:pPr>
+        <w:pStyle w:val="NormalWeb"/>
         <w:numPr>
           <w:ilvl w:val="0"/>
           <w:numId w:val="2"/>
         </w:numPr>
         <w:rPr>
           <w:rFonts w:ascii="Arial" w:hAnsi="Arial" w:cs="Arial"/>
-        </w:rPr>
-      </w:pPr>
-      <w:r>
-        <w:rPr>
-          <w:rFonts w:ascii="Arial" w:hAnsi="Arial" w:cs="Arial"/>
-        </w:rPr>
-        <w:t>Visualizes attack mitigation and latency preservation through a local dashboard.</w:t>
-      </w:r>
+          <w:sz w:val="22"/>
+          <w:szCs w:val="22"/>
+        </w:rPr>
+      </w:pPr>
+      <w:r>
+        <w:rPr>
+          <w:rFonts w:ascii="Arial" w:hAnsi="Arial" w:cs="Arial"/>
+          <w:sz w:val="22"/>
+          <w:szCs w:val="22"/>
+        </w:rPr>
+        <w:t>Studies the attack mitigation and latency preservation using a local GUI.</w:t>
+      </w:r>
+    </w:p>
+    <w:p>
+      <w:pPr>
+        <w:ind w:left="720"/>
+        <w:rPr>
+          <w:rFonts w:ascii="Arial" w:hAnsi="Arial" w:cs="Arial"/>
+        </w:rPr>
+      </w:pPr>
     </w:p>
     <w:p>
       <w:pPr>
@@ -1056,7 +1072,6 @@
           <w:sz w:val="24"/>
           <w:szCs w:val="24"/>
         </w:rPr>
-        <w:lastRenderedPageBreak/>
         <w:t>6. Solution Method / Architecture:</w:t>
       </w:r>
     </w:p>
@@ -1237,25 +1252,7 @@
           <w:b/>
           <w:bCs/>
         </w:rPr>
-        <w:t xml:space="preserve">Grafana / </w:t>
-      </w:r>
-      <w:proofErr w:type="spellStart"/>
-      <w:r>
-        <w:rPr>
-          <w:rFonts w:ascii="Arial" w:hAnsi="Arial" w:cs="Arial"/>
-          <w:b/>
-          <w:bCs/>
-        </w:rPr>
-        <w:t>Streamlit</w:t>
-      </w:r>
-      <w:proofErr w:type="spellEnd"/>
-      <w:r>
-        <w:rPr>
-          <w:rFonts w:ascii="Arial" w:hAnsi="Arial" w:cs="Arial"/>
-          <w:b/>
-          <w:bCs/>
-        </w:rPr>
-        <w:t>:</w:t>
+        <w:t>Grafana / Streamlit:</w:t>
       </w:r>
       <w:r>
         <w:rPr>
@@ -1539,7 +1536,6 @@
           <w:b/>
           <w:bCs/>
         </w:rPr>
-        <w:lastRenderedPageBreak/>
         <w:t>Methodology Diagram:</w:t>
       </w:r>
     </w:p>
@@ -1558,9 +1554,9 @@
           <w:szCs w:val="24"/>
         </w:rPr>
         <w:drawing>
-          <wp:inline distT="0" distB="0" distL="0" distR="0" wp14:anchorId="4BE864BD" wp14:editId="2242160C">
-            <wp:extent cx="2816860" cy="8530590"/>
-            <wp:effectExtent l="19050" t="19050" r="21590" b="22860"/>
+          <wp:inline distT="0" distB="0" distL="0" distR="0" wp14:anchorId="4BE864BD" wp14:editId="4FF6FDD5">
+            <wp:extent cx="2724150" cy="8249827"/>
+            <wp:effectExtent l="19050" t="19050" r="19050" b="18415"/>
             <wp:docPr id="636954961" name="Picture 2"/>
             <wp:cNvGraphicFramePr>
               <a:graphicFrameLocks xmlns:a="http://schemas.openxmlformats.org/drawingml/2006/main" noChangeAspect="1"/>
@@ -1587,7 +1583,7 @@
                   <pic:spPr>
                     <a:xfrm>
                       <a:off x="0" y="0"/>
-                      <a:ext cx="2816860" cy="8530590"/>
+                      <a:ext cx="2730285" cy="8268407"/>
                     </a:xfrm>
                     <a:prstGeom prst="rect">
                       <a:avLst/>
@@ -1614,6 +1610,19 @@
       <w:r>
         <w:rPr>
           <w:rFonts w:ascii="Arial" w:hAnsi="Arial" w:cs="Arial"/>
+        </w:rPr>
+        <w:t xml:space="preserve">                                            Figure 6.1: Methodology diagram</w:t>
+      </w:r>
+    </w:p>
+    <w:p>
+      <w:pPr>
+        <w:rPr>
+          <w:rFonts w:ascii="Arial" w:hAnsi="Arial" w:cs="Arial"/>
+        </w:rPr>
+      </w:pPr>
+      <w:r>
+        <w:rPr>
+          <w:rFonts w:ascii="Arial" w:hAnsi="Arial" w:cs="Arial"/>
           <w:b/>
           <w:bCs/>
           <w:sz w:val="24"/>
@@ -1623,601 +1632,21 @@
         <w:t>7. Work Breakdown Structure &amp; Gantt Chart:</w:t>
       </w:r>
     </w:p>
-    <w:tbl>
-      <w:tblPr>
-        <w:tblStyle w:val="TableGrid"/>
-        <w:tblW w:w="0" w:type="auto"/>
-        <w:tblLook w:val="04A0" w:firstRow="1" w:lastRow="0" w:firstColumn="1" w:lastColumn="0" w:noHBand="0" w:noVBand="1"/>
-      </w:tblPr>
-      <w:tblGrid>
-        <w:gridCol w:w="3005"/>
-        <w:gridCol w:w="3005"/>
-        <w:gridCol w:w="3006"/>
-      </w:tblGrid>
-      <w:tr>
-        <w:tc>
-          <w:tcPr>
-            <w:tcW w:w="3005" w:type="dxa"/>
-            <w:vAlign w:val="center"/>
-          </w:tcPr>
-          <w:p>
-            <w:pPr>
-              <w:rPr>
-                <w:rFonts w:ascii="Arial" w:hAnsi="Arial" w:cs="Arial"/>
-              </w:rPr>
-            </w:pPr>
-            <w:r>
-              <w:rPr>
-                <w:rFonts w:ascii="Arial" w:hAnsi="Arial" w:cs="Arial"/>
-                <w:b/>
-                <w:bCs/>
-              </w:rPr>
-              <w:t>Phase</w:t>
-            </w:r>
-          </w:p>
-        </w:tc>
-        <w:tc>
-          <w:tcPr>
-            <w:tcW w:w="3005" w:type="dxa"/>
-            <w:vAlign w:val="center"/>
-          </w:tcPr>
-          <w:p>
-            <w:pPr>
-              <w:rPr>
-                <w:rFonts w:ascii="Arial" w:hAnsi="Arial" w:cs="Arial"/>
-              </w:rPr>
-            </w:pPr>
-            <w:r>
-              <w:rPr>
-                <w:rFonts w:ascii="Arial" w:hAnsi="Arial" w:cs="Arial"/>
-                <w:b/>
-                <w:bCs/>
-              </w:rPr>
-              <w:t>Tasks</w:t>
-            </w:r>
-          </w:p>
-        </w:tc>
-        <w:tc>
-          <w:tcPr>
-            <w:tcW w:w="3006" w:type="dxa"/>
-            <w:vAlign w:val="center"/>
-          </w:tcPr>
-          <w:p>
-            <w:pPr>
-              <w:rPr>
-                <w:rFonts w:ascii="Arial" w:hAnsi="Arial" w:cs="Arial"/>
-              </w:rPr>
-            </w:pPr>
-            <w:r>
-              <w:rPr>
-                <w:rFonts w:ascii="Arial" w:hAnsi="Arial" w:cs="Arial"/>
-                <w:b/>
-                <w:bCs/>
-              </w:rPr>
-              <w:t>Duration</w:t>
-            </w:r>
-          </w:p>
-        </w:tc>
-      </w:tr>
-      <w:tr>
-        <w:tc>
-          <w:tcPr>
-            <w:tcW w:w="3005" w:type="dxa"/>
-            <w:vAlign w:val="center"/>
-          </w:tcPr>
-          <w:p>
-            <w:pPr>
-              <w:rPr>
-                <w:rFonts w:ascii="Arial" w:hAnsi="Arial" w:cs="Arial"/>
-              </w:rPr>
-            </w:pPr>
-            <w:r>
-              <w:rPr>
-                <w:rFonts w:ascii="Arial" w:hAnsi="Arial" w:cs="Arial"/>
-                <w:b/>
-                <w:bCs/>
-              </w:rPr>
-              <w:t>Phase 1</w:t>
-            </w:r>
-            <w:r>
-              <w:rPr>
-                <w:rFonts w:ascii="Arial" w:hAnsi="Arial" w:cs="Arial"/>
-                <w:b/>
-                <w:bCs/>
-              </w:rPr>
-              <w:t>:</w:t>
-            </w:r>
-            <w:r>
-              <w:rPr>
-                <w:rFonts w:ascii="Arial" w:hAnsi="Arial" w:cs="Arial"/>
-                <w:b/>
-                <w:bCs/>
-              </w:rPr>
-              <w:t xml:space="preserve"> Research &amp; Setup</w:t>
-            </w:r>
-          </w:p>
-        </w:tc>
-        <w:tc>
-          <w:tcPr>
-            <w:tcW w:w="3005" w:type="dxa"/>
-            <w:vAlign w:val="center"/>
-          </w:tcPr>
-          <w:p>
-            <w:pPr>
-              <w:rPr>
-                <w:rFonts w:ascii="Arial" w:hAnsi="Arial" w:cs="Arial"/>
-              </w:rPr>
-            </w:pPr>
-            <w:r>
-              <w:rPr>
-                <w:rFonts w:ascii="Arial" w:hAnsi="Arial" w:cs="Arial"/>
-              </w:rPr>
-              <w:t>Literature review, Dataset acquisition (PCAP files), GNS3/Mininet installation</w:t>
-            </w:r>
-          </w:p>
-        </w:tc>
-        <w:tc>
-          <w:tcPr>
-            <w:tcW w:w="3006" w:type="dxa"/>
-            <w:vAlign w:val="center"/>
-          </w:tcPr>
-          <w:p>
-            <w:pPr>
-              <w:rPr>
-                <w:rFonts w:ascii="Arial" w:hAnsi="Arial" w:cs="Arial"/>
-              </w:rPr>
-            </w:pPr>
-            <w:r>
-              <w:rPr>
-                <w:rFonts w:ascii="Arial" w:hAnsi="Arial" w:cs="Arial"/>
-              </w:rPr>
-              <w:t>Week 1 – Week 2</w:t>
-            </w:r>
-          </w:p>
-        </w:tc>
-      </w:tr>
-      <w:tr>
-        <w:tc>
-          <w:tcPr>
-            <w:tcW w:w="3005" w:type="dxa"/>
-            <w:vAlign w:val="center"/>
-          </w:tcPr>
-          <w:p>
-            <w:pPr>
-              <w:rPr>
-                <w:rFonts w:ascii="Arial" w:hAnsi="Arial" w:cs="Arial"/>
-              </w:rPr>
-            </w:pPr>
-            <w:r>
-              <w:rPr>
-                <w:rFonts w:ascii="Arial" w:hAnsi="Arial" w:cs="Arial"/>
-                <w:b/>
-                <w:bCs/>
-              </w:rPr>
-              <w:t>Phase 2</w:t>
-            </w:r>
-            <w:r>
-              <w:rPr>
-                <w:rFonts w:ascii="Arial" w:hAnsi="Arial" w:cs="Arial"/>
-                <w:b/>
-                <w:bCs/>
-              </w:rPr>
-              <w:t>:</w:t>
-            </w:r>
-            <w:r>
-              <w:rPr>
-                <w:rFonts w:ascii="Arial" w:hAnsi="Arial" w:cs="Arial"/>
-                <w:b/>
-                <w:bCs/>
-              </w:rPr>
-              <w:t xml:space="preserve"> Data Preparation</w:t>
-            </w:r>
-          </w:p>
-        </w:tc>
-        <w:tc>
-          <w:tcPr>
-            <w:tcW w:w="3005" w:type="dxa"/>
-            <w:vAlign w:val="center"/>
-          </w:tcPr>
-          <w:p>
-            <w:pPr>
-              <w:rPr>
-                <w:rFonts w:ascii="Arial" w:hAnsi="Arial" w:cs="Arial"/>
-              </w:rPr>
-            </w:pPr>
-            <w:r>
-              <w:rPr>
-                <w:rFonts w:ascii="Arial" w:hAnsi="Arial" w:cs="Arial"/>
-              </w:rPr>
-              <w:t>Parsing network traffic, Feature engineering (packet size, interval)</w:t>
-            </w:r>
-          </w:p>
-        </w:tc>
-        <w:tc>
-          <w:tcPr>
-            <w:tcW w:w="3006" w:type="dxa"/>
-            <w:vAlign w:val="center"/>
-          </w:tcPr>
-          <w:p>
-            <w:pPr>
-              <w:rPr>
-                <w:rFonts w:ascii="Arial" w:hAnsi="Arial" w:cs="Arial"/>
-              </w:rPr>
-            </w:pPr>
-            <w:r>
-              <w:rPr>
-                <w:rFonts w:ascii="Arial" w:hAnsi="Arial" w:cs="Arial"/>
-              </w:rPr>
-              <w:t>Week 3 – Week 4</w:t>
-            </w:r>
-          </w:p>
-        </w:tc>
-      </w:tr>
-      <w:tr>
-        <w:tc>
-          <w:tcPr>
-            <w:tcW w:w="3005" w:type="dxa"/>
-            <w:vAlign w:val="center"/>
-          </w:tcPr>
-          <w:p>
-            <w:pPr>
-              <w:rPr>
-                <w:rFonts w:ascii="Arial" w:hAnsi="Arial" w:cs="Arial"/>
-              </w:rPr>
-            </w:pPr>
-            <w:r>
-              <w:rPr>
-                <w:rFonts w:ascii="Arial" w:hAnsi="Arial" w:cs="Arial"/>
-                <w:b/>
-                <w:bCs/>
-              </w:rPr>
-              <w:t>Phase 3</w:t>
-            </w:r>
-            <w:r>
-              <w:rPr>
-                <w:rFonts w:ascii="Arial" w:hAnsi="Arial" w:cs="Arial"/>
-                <w:b/>
-                <w:bCs/>
-              </w:rPr>
-              <w:t>:</w:t>
-            </w:r>
-            <w:r>
-              <w:rPr>
-                <w:rFonts w:ascii="Arial" w:hAnsi="Arial" w:cs="Arial"/>
-                <w:b/>
-                <w:bCs/>
-              </w:rPr>
-              <w:t xml:space="preserve"> Model </w:t>
-            </w:r>
-            <w:r>
-              <w:rPr>
-                <w:rFonts w:ascii="Arial" w:hAnsi="Arial" w:cs="Arial"/>
-                <w:b/>
-                <w:bCs/>
-              </w:rPr>
-              <w:t xml:space="preserve">        </w:t>
-            </w:r>
-            <w:r>
-              <w:rPr>
-                <w:rFonts w:ascii="Arial" w:hAnsi="Arial" w:cs="Arial"/>
-                <w:b/>
-                <w:bCs/>
-              </w:rPr>
-              <w:t>Development</w:t>
-            </w:r>
-          </w:p>
-        </w:tc>
-        <w:tc>
-          <w:tcPr>
-            <w:tcW w:w="3005" w:type="dxa"/>
-            <w:vAlign w:val="center"/>
-          </w:tcPr>
-          <w:p>
-            <w:pPr>
-              <w:rPr>
-                <w:rFonts w:ascii="Arial" w:hAnsi="Arial" w:cs="Arial"/>
-              </w:rPr>
-            </w:pPr>
-            <w:r>
-              <w:rPr>
-                <w:rFonts w:ascii="Arial" w:hAnsi="Arial" w:cs="Arial"/>
-              </w:rPr>
-              <w:t>Training Random Forest/LightGBM, Model evaluation, Latency tuning</w:t>
-            </w:r>
-          </w:p>
-        </w:tc>
-        <w:tc>
-          <w:tcPr>
-            <w:tcW w:w="3006" w:type="dxa"/>
-            <w:vAlign w:val="center"/>
-          </w:tcPr>
-          <w:p>
-            <w:pPr>
-              <w:rPr>
-                <w:rFonts w:ascii="Arial" w:hAnsi="Arial" w:cs="Arial"/>
-              </w:rPr>
-            </w:pPr>
-            <w:r>
-              <w:rPr>
-                <w:rFonts w:ascii="Arial" w:hAnsi="Arial" w:cs="Arial"/>
-              </w:rPr>
-              <w:t>Week 4 – Week 5</w:t>
-            </w:r>
-          </w:p>
-        </w:tc>
-      </w:tr>
-      <w:tr>
-        <w:tc>
-          <w:tcPr>
-            <w:tcW w:w="3005" w:type="dxa"/>
-            <w:vAlign w:val="center"/>
-          </w:tcPr>
-          <w:p>
-            <w:pPr>
-              <w:rPr>
-                <w:rFonts w:ascii="Arial" w:hAnsi="Arial" w:cs="Arial"/>
-              </w:rPr>
-            </w:pPr>
-            <w:r>
-              <w:rPr>
-                <w:rFonts w:ascii="Arial" w:hAnsi="Arial" w:cs="Arial"/>
-                <w:b/>
-                <w:bCs/>
-              </w:rPr>
-              <w:t>Phase 4</w:t>
-            </w:r>
-            <w:r>
-              <w:rPr>
-                <w:rFonts w:ascii="Arial" w:hAnsi="Arial" w:cs="Arial"/>
-                <w:b/>
-                <w:bCs/>
-              </w:rPr>
-              <w:t>:</w:t>
-            </w:r>
-            <w:r>
-              <w:rPr>
-                <w:rFonts w:ascii="Arial" w:hAnsi="Arial" w:cs="Arial"/>
-                <w:b/>
-                <w:bCs/>
-              </w:rPr>
-              <w:t xml:space="preserve"> Edge Integration</w:t>
-            </w:r>
-          </w:p>
-        </w:tc>
-        <w:tc>
-          <w:tcPr>
-            <w:tcW w:w="3005" w:type="dxa"/>
-            <w:vAlign w:val="center"/>
-          </w:tcPr>
-          <w:p>
-            <w:pPr>
-              <w:rPr>
-                <w:rFonts w:ascii="Arial" w:hAnsi="Arial" w:cs="Arial"/>
-              </w:rPr>
-            </w:pPr>
-            <w:r>
-              <w:rPr>
-                <w:rFonts w:ascii="Arial" w:hAnsi="Arial" w:cs="Arial"/>
-              </w:rPr>
-              <w:t>Writing eBPF/XDP scripts in C/Python, Linking AI rules to kernel filters</w:t>
-            </w:r>
-          </w:p>
-        </w:tc>
-        <w:tc>
-          <w:tcPr>
-            <w:tcW w:w="3006" w:type="dxa"/>
-            <w:vAlign w:val="center"/>
-          </w:tcPr>
-          <w:p>
-            <w:pPr>
-              <w:rPr>
-                <w:rFonts w:ascii="Arial" w:hAnsi="Arial" w:cs="Arial"/>
-              </w:rPr>
-            </w:pPr>
-            <w:r>
-              <w:rPr>
-                <w:rFonts w:ascii="Arial" w:hAnsi="Arial" w:cs="Arial"/>
-              </w:rPr>
-              <w:t>Week 6 – Week 7</w:t>
-            </w:r>
-          </w:p>
-        </w:tc>
-      </w:tr>
-      <w:tr>
-        <w:tc>
-          <w:tcPr>
-            <w:tcW w:w="3005" w:type="dxa"/>
-            <w:vAlign w:val="center"/>
-          </w:tcPr>
-          <w:p>
-            <w:pPr>
-              <w:rPr>
-                <w:rFonts w:ascii="Arial" w:hAnsi="Arial" w:cs="Arial"/>
-              </w:rPr>
-            </w:pPr>
-            <w:r>
-              <w:rPr>
-                <w:rFonts w:ascii="Arial" w:hAnsi="Arial" w:cs="Arial"/>
-                <w:b/>
-                <w:bCs/>
-              </w:rPr>
-              <w:t>Phase 5</w:t>
-            </w:r>
-            <w:r>
-              <w:rPr>
-                <w:rFonts w:ascii="Arial" w:hAnsi="Arial" w:cs="Arial"/>
-                <w:b/>
-                <w:bCs/>
-              </w:rPr>
-              <w:t>:</w:t>
-            </w:r>
-            <w:r>
-              <w:rPr>
-                <w:rFonts w:ascii="Arial" w:hAnsi="Arial" w:cs="Arial"/>
-                <w:b/>
-                <w:bCs/>
-              </w:rPr>
-              <w:t xml:space="preserve"> Simulation &amp; UI</w:t>
-            </w:r>
-          </w:p>
-        </w:tc>
-        <w:tc>
-          <w:tcPr>
-            <w:tcW w:w="3005" w:type="dxa"/>
-            <w:vAlign w:val="center"/>
-          </w:tcPr>
-          <w:p>
-            <w:pPr>
-              <w:rPr>
-                <w:rFonts w:ascii="Arial" w:hAnsi="Arial" w:cs="Arial"/>
-              </w:rPr>
-            </w:pPr>
-            <w:r>
-              <w:rPr>
-                <w:rFonts w:ascii="Arial" w:hAnsi="Arial" w:cs="Arial"/>
-              </w:rPr>
-              <w:t>Running Mininet DDoS attacks, Dashboard UI design for traffic monitoring</w:t>
-            </w:r>
-          </w:p>
-        </w:tc>
-        <w:tc>
-          <w:tcPr>
-            <w:tcW w:w="3006" w:type="dxa"/>
-            <w:vAlign w:val="center"/>
-          </w:tcPr>
-          <w:p>
-            <w:pPr>
-              <w:rPr>
-                <w:rFonts w:ascii="Arial" w:hAnsi="Arial" w:cs="Arial"/>
-              </w:rPr>
-            </w:pPr>
-            <w:r>
-              <w:rPr>
-                <w:rFonts w:ascii="Arial" w:hAnsi="Arial" w:cs="Arial"/>
-              </w:rPr>
-              <w:t>Week 7 – Week 8</w:t>
-            </w:r>
-          </w:p>
-        </w:tc>
-      </w:tr>
-      <w:tr>
-        <w:tc>
-          <w:tcPr>
-            <w:tcW w:w="3005" w:type="dxa"/>
-            <w:vAlign w:val="center"/>
-          </w:tcPr>
-          <w:p>
-            <w:pPr>
-              <w:rPr>
-                <w:rFonts w:ascii="Arial" w:hAnsi="Arial" w:cs="Arial"/>
-              </w:rPr>
-            </w:pPr>
-            <w:r>
-              <w:rPr>
-                <w:rFonts w:ascii="Arial" w:hAnsi="Arial" w:cs="Arial"/>
-                <w:b/>
-                <w:bCs/>
-              </w:rPr>
-              <w:t>Phase 6</w:t>
-            </w:r>
-            <w:r>
-              <w:rPr>
-                <w:rFonts w:ascii="Arial" w:hAnsi="Arial" w:cs="Arial"/>
-                <w:b/>
-                <w:bCs/>
-              </w:rPr>
-              <w:t>:</w:t>
-            </w:r>
-            <w:r>
-              <w:rPr>
-                <w:rFonts w:ascii="Arial" w:hAnsi="Arial" w:cs="Arial"/>
-                <w:b/>
-                <w:bCs/>
-              </w:rPr>
-              <w:t xml:space="preserve"> Testing &amp; Docs</w:t>
-            </w:r>
-          </w:p>
-        </w:tc>
-        <w:tc>
-          <w:tcPr>
-            <w:tcW w:w="3005" w:type="dxa"/>
-            <w:vAlign w:val="center"/>
-          </w:tcPr>
-          <w:p>
-            <w:pPr>
-              <w:rPr>
-                <w:rFonts w:ascii="Arial" w:hAnsi="Arial" w:cs="Arial"/>
-              </w:rPr>
-            </w:pPr>
-            <w:r>
-              <w:rPr>
-                <w:rFonts w:ascii="Arial" w:hAnsi="Arial" w:cs="Arial"/>
-              </w:rPr>
-              <w:t>System testing (measuring ping/lag), Report writing</w:t>
-            </w:r>
-          </w:p>
-        </w:tc>
-        <w:tc>
-          <w:tcPr>
-            <w:tcW w:w="3006" w:type="dxa"/>
-            <w:vAlign w:val="center"/>
-          </w:tcPr>
-          <w:p>
-            <w:pPr>
-              <w:rPr>
-                <w:rFonts w:ascii="Arial" w:hAnsi="Arial" w:cs="Arial"/>
-              </w:rPr>
-            </w:pPr>
-            <w:r>
-              <w:rPr>
-                <w:rFonts w:ascii="Arial" w:hAnsi="Arial" w:cs="Arial"/>
-              </w:rPr>
-              <w:t>Week 9 – Week 10</w:t>
-            </w:r>
-          </w:p>
-        </w:tc>
-      </w:tr>
-    </w:tbl>
-    <w:p>
-      <w:pPr>
-        <w:rPr>
-          <w:rFonts w:ascii="Arial" w:hAnsi="Arial" w:cs="Arial"/>
-        </w:rPr>
-      </w:pPr>
-    </w:p>
-    <w:p>
-      <w:pPr>
-        <w:rPr>
-          <w:rFonts w:ascii="Arial" w:hAnsi="Arial" w:cs="Arial"/>
-          <w:b/>
-          <w:bCs/>
-        </w:rPr>
-      </w:pPr>
-      <w:r>
-        <w:rPr>
-          <w:rFonts w:ascii="Arial" w:hAnsi="Arial" w:cs="Arial"/>
-          <w:b/>
-          <w:bCs/>
-        </w:rPr>
-        <w:t>Gantt Chart:</w:t>
-      </w:r>
-    </w:p>
-    <w:p>
-      <w:pPr>
-        <w:rPr>
-          <w:rFonts w:ascii="Arial" w:hAnsi="Arial" w:cs="Arial"/>
-        </w:rPr>
-      </w:pPr>
-      <w:r>
-        <w:rPr>
-          <w:rFonts w:ascii="Arial" w:hAnsi="Arial" w:cs="Arial"/>
-          <w:noProof/>
+    <w:p>
+      <w:pPr>
+        <w:rPr>
+          <w:rFonts w:ascii="Arial" w:hAnsi="Arial" w:cs="Arial"/>
+        </w:rPr>
+      </w:pPr>
+      <w:r>
+        <w:rPr>
+          <w:rFonts w:ascii="Arial" w:hAnsi="Arial" w:cs="Arial"/>
         </w:rPr>
         <w:drawing>
-          <wp:inline distT="0" distB="0" distL="0" distR="0" wp14:anchorId="47DB9ACD" wp14:editId="0856234A">
-            <wp:extent cx="5731510" cy="2555240"/>
+          <wp:inline distT="0" distB="0" distL="0" distR="0" wp14:anchorId="17D55B63" wp14:editId="2161BDF4">
+            <wp:extent cx="5731510" cy="2952750"/>
             <wp:effectExtent l="0" t="0" r="2540" b="0"/>
-            <wp:docPr id="1262527606" name="Picture 1"/>
+            <wp:docPr id="2006290612" name="Picture 1"/>
             <wp:cNvGraphicFramePr>
               <a:graphicFrameLocks xmlns:a="http://schemas.openxmlformats.org/drawingml/2006/main" noChangeAspect="1"/>
             </wp:cNvGraphicFramePr>
@@ -2225,7 +1654,7 @@
               <a:graphicData uri="http://schemas.openxmlformats.org/drawingml/2006/picture">
                 <pic:pic xmlns:pic="http://schemas.openxmlformats.org/drawingml/2006/picture">
                   <pic:nvPicPr>
-                    <pic:cNvPr id="1262527606" name=""/>
+                    <pic:cNvPr id="2006290612" name=""/>
                     <pic:cNvPicPr/>
                   </pic:nvPicPr>
                   <pic:blipFill>
@@ -2237,7 +1666,7 @@
                   <pic:spPr>
                     <a:xfrm>
                       <a:off x="0" y="0"/>
-                      <a:ext cx="5731510" cy="2555240"/>
+                      <a:ext cx="5731510" cy="2952750"/>
                     </a:xfrm>
                     <a:prstGeom prst="rect">
                       <a:avLst/>
@@ -2256,6 +1685,191 @@
           <w:rFonts w:ascii="Arial" w:hAnsi="Arial" w:cs="Arial"/>
         </w:rPr>
       </w:pPr>
+      <w:r>
+        <w:rPr>
+          <w:rFonts w:ascii="Arial" w:hAnsi="Arial" w:cs="Arial"/>
+        </w:rPr>
+        <w:tab/>
+      </w:r>
+      <w:r>
+        <w:rPr>
+          <w:rFonts w:ascii="Arial" w:hAnsi="Arial" w:cs="Arial"/>
+        </w:rPr>
+        <w:tab/>
+      </w:r>
+      <w:r>
+        <w:rPr>
+          <w:rFonts w:ascii="Arial" w:hAnsi="Arial" w:cs="Arial"/>
+        </w:rPr>
+        <w:tab/>
+      </w:r>
+      <w:r>
+        <w:rPr>
+          <w:rFonts w:ascii="Arial" w:hAnsi="Arial" w:cs="Arial"/>
+        </w:rPr>
+        <w:tab/>
+        <w:t>Table 7.1: Work Breakdown Structure</w:t>
+      </w:r>
+    </w:p>
+    <w:p>
+      <w:pPr>
+        <w:rPr>
+          <w:rFonts w:ascii="Arial" w:hAnsi="Arial" w:cs="Arial"/>
+        </w:rPr>
+      </w:pPr>
+    </w:p>
+    <w:p>
+      <w:pPr>
+        <w:rPr>
+          <w:rFonts w:ascii="Arial" w:hAnsi="Arial" w:cs="Arial"/>
+          <w:b/>
+          <w:bCs/>
+        </w:rPr>
+      </w:pPr>
+      <w:r>
+        <w:rPr>
+          <w:rFonts w:ascii="Arial" w:hAnsi="Arial" w:cs="Arial"/>
+          <w:b/>
+          <w:bCs/>
+        </w:rPr>
+        <w:t>Gantt Chart:</w:t>
+      </w:r>
+    </w:p>
+    <w:p>
+      <w:pPr>
+        <w:rPr>
+          <w:rFonts w:ascii="Arial" w:hAnsi="Arial" w:cs="Arial"/>
+        </w:rPr>
+      </w:pPr>
+      <w:r>
+        <w:rPr>
+          <w:rFonts w:ascii="Arial" w:hAnsi="Arial" w:cs="Arial"/>
+          <w:szCs w:val="20"/>
+        </w:rPr>
+        <w:drawing>
+          <wp:inline distT="0" distB="0" distL="0" distR="0" wp14:anchorId="5CAFC44E" wp14:editId="065D9A59">
+            <wp:extent cx="5731510" cy="2744547"/>
+            <wp:effectExtent l="19050" t="19050" r="21590" b="17780"/>
+            <wp:docPr id="1565596604" name="Picture 2"/>
+            <wp:cNvGraphicFramePr>
+              <a:graphicFrameLocks xmlns:a="http://schemas.openxmlformats.org/drawingml/2006/main" noChangeAspect="1"/>
+            </wp:cNvGraphicFramePr>
+            <a:graphic xmlns:a="http://schemas.openxmlformats.org/drawingml/2006/main">
+              <a:graphicData uri="http://schemas.openxmlformats.org/drawingml/2006/picture">
+                <pic:pic xmlns:pic="http://schemas.openxmlformats.org/drawingml/2006/picture">
+                  <pic:nvPicPr>
+                    <pic:cNvPr id="0" name="Picture 6"/>
+                    <pic:cNvPicPr>
+                      <a:picLocks noChangeAspect="1" noChangeArrowheads="1"/>
+                    </pic:cNvPicPr>
+                  </pic:nvPicPr>
+                  <pic:blipFill>
+                    <a:blip r:embed="rId8" cstate="print">
+                      <a:extLst>
+                        <a:ext uri="{28A0092B-C50C-407E-A947-70E740481C1C}">
+                          <a14:useLocalDpi xmlns:a14="http://schemas.microsoft.com/office/drawing/2010/main" val="0"/>
+                        </a:ext>
+                      </a:extLst>
+                    </a:blip>
+                    <a:srcRect/>
+                    <a:stretch>
+                      <a:fillRect/>
+                    </a:stretch>
+                  </pic:blipFill>
+                  <pic:spPr bwMode="auto">
+                    <a:xfrm>
+                      <a:off x="0" y="0"/>
+                      <a:ext cx="5731510" cy="2744547"/>
+                    </a:xfrm>
+                    <a:prstGeom prst="rect">
+                      <a:avLst/>
+                    </a:prstGeom>
+                    <a:noFill/>
+                    <a:ln>
+                      <a:solidFill>
+                        <a:schemeClr val="tx1"/>
+                      </a:solidFill>
+                    </a:ln>
+                  </pic:spPr>
+                </pic:pic>
+              </a:graphicData>
+            </a:graphic>
+          </wp:inline>
+        </w:drawing>
+      </w:r>
+    </w:p>
+    <w:p>
+      <w:pPr>
+        <w:rPr>
+          <w:rFonts w:ascii="Arial" w:hAnsi="Arial" w:cs="Arial"/>
+        </w:rPr>
+      </w:pPr>
+      <w:r>
+        <w:rPr>
+          <w:rFonts w:ascii="Arial" w:hAnsi="Arial" w:cs="Arial"/>
+        </w:rPr>
+        <w:tab/>
+      </w:r>
+      <w:r>
+        <w:rPr>
+          <w:rFonts w:ascii="Arial" w:hAnsi="Arial" w:cs="Arial"/>
+        </w:rPr>
+        <w:tab/>
+      </w:r>
+      <w:r>
+        <w:rPr>
+          <w:rFonts w:ascii="Arial" w:hAnsi="Arial" w:cs="Arial"/>
+        </w:rPr>
+        <w:tab/>
+      </w:r>
+      <w:r>
+        <w:rPr>
+          <w:rFonts w:ascii="Arial" w:hAnsi="Arial" w:cs="Arial"/>
+        </w:rPr>
+        <w:tab/>
+      </w:r>
+      <w:r>
+        <w:rPr>
+          <w:rFonts w:ascii="Arial" w:hAnsi="Arial" w:cs="Arial"/>
+        </w:rPr>
+        <w:tab/>
+        <w:t>Figure 7.1: Gantt chart</w:t>
+      </w:r>
+    </w:p>
+    <w:p>
+      <w:pPr>
+        <w:rPr>
+          <w:rFonts w:ascii="Arial" w:hAnsi="Arial" w:cs="Arial"/>
+        </w:rPr>
+      </w:pPr>
+    </w:p>
+    <w:p>
+      <w:pPr>
+        <w:rPr>
+          <w:rFonts w:ascii="Arial" w:hAnsi="Arial" w:cs="Arial"/>
+        </w:rPr>
+      </w:pPr>
+    </w:p>
+    <w:p>
+      <w:pPr>
+        <w:rPr>
+          <w:rFonts w:ascii="Arial" w:hAnsi="Arial" w:cs="Arial"/>
+        </w:rPr>
+      </w:pPr>
+    </w:p>
+    <w:p>
+      <w:pPr>
+        <w:rPr>
+          <w:rFonts w:ascii="Arial" w:hAnsi="Arial" w:cs="Arial"/>
+        </w:rPr>
+      </w:pPr>
+    </w:p>
+    <w:p>
+      <w:pPr>
+        <w:rPr>
+          <w:rFonts w:ascii="Arial" w:hAnsi="Arial" w:cs="Arial"/>
+        </w:rPr>
+      </w:pPr>
     </w:p>
     <w:p>
       <w:pPr>
@@ -2273,6 +1887,7 @@
           <w:sz w:val="24"/>
           <w:szCs w:val="24"/>
         </w:rPr>
+        <w:lastRenderedPageBreak/>
         <w:t>8. Risk Assessment:</w:t>
       </w:r>
     </w:p>
@@ -2291,358 +1906,101 @@
         <w:t>Risk Analysis</w:t>
       </w:r>
     </w:p>
-    <w:tbl>
-      <w:tblPr>
-        <w:tblStyle w:val="TableGrid"/>
-        <w:tblW w:w="9014" w:type="dxa"/>
-        <w:tblLook w:val="04A0" w:firstRow="1" w:lastRow="0" w:firstColumn="1" w:lastColumn="0" w:noHBand="0" w:noVBand="1"/>
-      </w:tblPr>
-      <w:tblGrid>
-        <w:gridCol w:w="3004"/>
-        <w:gridCol w:w="3005"/>
-        <w:gridCol w:w="3005"/>
-      </w:tblGrid>
-      <w:tr>
-        <w:tc>
-          <w:tcPr>
-            <w:tcW w:w="3004" w:type="dxa"/>
-            <w:vAlign w:val="center"/>
-          </w:tcPr>
-          <w:p>
-            <w:pPr>
-              <w:rPr>
-                <w:rFonts w:ascii="Arial" w:hAnsi="Arial" w:cs="Arial"/>
-                <w:b/>
-                <w:bCs/>
-              </w:rPr>
-            </w:pPr>
-            <w:r>
-              <w:rPr>
-                <w:rFonts w:ascii="Arial" w:hAnsi="Arial" w:cs="Arial"/>
-                <w:b/>
-                <w:bCs/>
-              </w:rPr>
-              <w:t>Risk</w:t>
-            </w:r>
-          </w:p>
-        </w:tc>
-        <w:tc>
-          <w:tcPr>
-            <w:tcW w:w="3005" w:type="dxa"/>
-            <w:vAlign w:val="center"/>
-          </w:tcPr>
-          <w:p>
-            <w:pPr>
-              <w:rPr>
-                <w:rFonts w:ascii="Arial" w:hAnsi="Arial" w:cs="Arial"/>
-                <w:b/>
-                <w:bCs/>
-              </w:rPr>
-            </w:pPr>
-            <w:r>
-              <w:rPr>
-                <w:rFonts w:ascii="Arial" w:hAnsi="Arial" w:cs="Arial"/>
-                <w:b/>
-                <w:bCs/>
-              </w:rPr>
-              <w:t>Likelihood</w:t>
-            </w:r>
-          </w:p>
-        </w:tc>
-        <w:tc>
-          <w:tcPr>
-            <w:tcW w:w="3005" w:type="dxa"/>
-            <w:vAlign w:val="center"/>
-          </w:tcPr>
-          <w:p>
-            <w:pPr>
-              <w:rPr>
-                <w:rFonts w:ascii="Arial" w:hAnsi="Arial" w:cs="Arial"/>
-                <w:b/>
-                <w:bCs/>
-              </w:rPr>
-            </w:pPr>
-            <w:r>
-              <w:rPr>
-                <w:rFonts w:ascii="Arial" w:hAnsi="Arial" w:cs="Arial"/>
-                <w:b/>
-                <w:bCs/>
-              </w:rPr>
-              <w:t>Impact</w:t>
-            </w:r>
-          </w:p>
-        </w:tc>
-      </w:tr>
-      <w:tr>
-        <w:tc>
-          <w:tcPr>
-            <w:tcW w:w="3004" w:type="dxa"/>
-            <w:vAlign w:val="center"/>
-          </w:tcPr>
-          <w:p>
-            <w:pPr>
-              <w:rPr>
-                <w:rFonts w:ascii="Arial" w:hAnsi="Arial" w:cs="Arial"/>
-                <w:b/>
-                <w:bCs/>
-              </w:rPr>
-            </w:pPr>
-            <w:r>
-              <w:rPr>
-                <w:rFonts w:ascii="Arial" w:hAnsi="Arial" w:cs="Arial"/>
-              </w:rPr>
-              <w:t>eBPF / Linux Kernel compatibility issues</w:t>
-            </w:r>
-          </w:p>
-        </w:tc>
-        <w:tc>
-          <w:tcPr>
-            <w:tcW w:w="3005" w:type="dxa"/>
-            <w:vAlign w:val="center"/>
-          </w:tcPr>
-          <w:p>
-            <w:pPr>
-              <w:rPr>
-                <w:rFonts w:ascii="Arial" w:hAnsi="Arial" w:cs="Arial"/>
-                <w:b/>
-                <w:bCs/>
-              </w:rPr>
-            </w:pPr>
-            <w:r>
-              <w:rPr>
-                <w:rFonts w:ascii="Arial" w:hAnsi="Arial" w:cs="Arial"/>
-              </w:rPr>
-              <w:t>Medium</w:t>
-            </w:r>
-          </w:p>
-        </w:tc>
-        <w:tc>
-          <w:tcPr>
-            <w:tcW w:w="3005" w:type="dxa"/>
-            <w:vAlign w:val="center"/>
-          </w:tcPr>
-          <w:p>
-            <w:pPr>
-              <w:rPr>
-                <w:rFonts w:ascii="Arial" w:hAnsi="Arial" w:cs="Arial"/>
-                <w:b/>
-                <w:bCs/>
-              </w:rPr>
-            </w:pPr>
-            <w:r>
-              <w:rPr>
-                <w:rFonts w:ascii="Arial" w:hAnsi="Arial" w:cs="Arial"/>
-              </w:rPr>
-              <w:t>High</w:t>
-            </w:r>
-          </w:p>
-        </w:tc>
-      </w:tr>
-      <w:tr>
-        <w:tc>
-          <w:tcPr>
-            <w:tcW w:w="3004" w:type="dxa"/>
-            <w:vAlign w:val="center"/>
-          </w:tcPr>
-          <w:p>
-            <w:pPr>
-              <w:rPr>
-                <w:rFonts w:ascii="Arial" w:hAnsi="Arial" w:cs="Arial"/>
-                <w:b/>
-                <w:bCs/>
-              </w:rPr>
-            </w:pPr>
-            <w:r>
-              <w:rPr>
-                <w:rFonts w:ascii="Arial" w:hAnsi="Arial" w:cs="Arial"/>
-              </w:rPr>
-              <w:t>Lack of modern, game-specific DDoS datasets</w:t>
-            </w:r>
-          </w:p>
-        </w:tc>
-        <w:tc>
-          <w:tcPr>
-            <w:tcW w:w="3005" w:type="dxa"/>
-            <w:vAlign w:val="center"/>
-          </w:tcPr>
-          <w:p>
-            <w:pPr>
-              <w:rPr>
-                <w:rFonts w:ascii="Arial" w:hAnsi="Arial" w:cs="Arial"/>
-                <w:b/>
-                <w:bCs/>
-              </w:rPr>
-            </w:pPr>
-            <w:r>
-              <w:rPr>
-                <w:rFonts w:ascii="Arial" w:hAnsi="Arial" w:cs="Arial"/>
-              </w:rPr>
-              <w:t>High</w:t>
-            </w:r>
-          </w:p>
-        </w:tc>
-        <w:tc>
-          <w:tcPr>
-            <w:tcW w:w="3005" w:type="dxa"/>
-            <w:vAlign w:val="center"/>
-          </w:tcPr>
-          <w:p>
-            <w:pPr>
-              <w:rPr>
-                <w:rFonts w:ascii="Arial" w:hAnsi="Arial" w:cs="Arial"/>
-                <w:b/>
-                <w:bCs/>
-              </w:rPr>
-            </w:pPr>
-            <w:r>
-              <w:rPr>
-                <w:rFonts w:ascii="Arial" w:hAnsi="Arial" w:cs="Arial"/>
-              </w:rPr>
-              <w:t>Medium</w:t>
-            </w:r>
-          </w:p>
-        </w:tc>
-      </w:tr>
-      <w:tr>
-        <w:tc>
-          <w:tcPr>
-            <w:tcW w:w="3004" w:type="dxa"/>
-            <w:vAlign w:val="center"/>
-          </w:tcPr>
-          <w:p>
-            <w:pPr>
-              <w:rPr>
-                <w:rFonts w:ascii="Arial" w:hAnsi="Arial" w:cs="Arial"/>
-                <w:b/>
-                <w:bCs/>
-              </w:rPr>
-            </w:pPr>
-            <w:r>
-              <w:rPr>
-                <w:rFonts w:ascii="Arial" w:hAnsi="Arial" w:cs="Arial"/>
-              </w:rPr>
-              <w:t>Hardware constraints running heavy GNS3 simulations</w:t>
-            </w:r>
-          </w:p>
-        </w:tc>
-        <w:tc>
-          <w:tcPr>
-            <w:tcW w:w="3005" w:type="dxa"/>
-            <w:vAlign w:val="center"/>
-          </w:tcPr>
-          <w:p>
-            <w:pPr>
-              <w:rPr>
-                <w:rFonts w:ascii="Arial" w:hAnsi="Arial" w:cs="Arial"/>
-                <w:b/>
-                <w:bCs/>
-              </w:rPr>
-            </w:pPr>
-            <w:r>
-              <w:rPr>
-                <w:rFonts w:ascii="Arial" w:hAnsi="Arial" w:cs="Arial"/>
-              </w:rPr>
-              <w:t>Medium</w:t>
-            </w:r>
-          </w:p>
-        </w:tc>
-        <w:tc>
-          <w:tcPr>
-            <w:tcW w:w="3005" w:type="dxa"/>
-            <w:vAlign w:val="center"/>
-          </w:tcPr>
-          <w:p>
-            <w:pPr>
-              <w:rPr>
-                <w:rFonts w:ascii="Arial" w:hAnsi="Arial" w:cs="Arial"/>
-                <w:b/>
-                <w:bCs/>
-              </w:rPr>
-            </w:pPr>
-            <w:r>
-              <w:rPr>
-                <w:rFonts w:ascii="Arial" w:hAnsi="Arial" w:cs="Arial"/>
-              </w:rPr>
-              <w:t>High</w:t>
-            </w:r>
-          </w:p>
-        </w:tc>
-      </w:tr>
-      <w:tr>
-        <w:tc>
-          <w:tcPr>
-            <w:tcW w:w="3004" w:type="dxa"/>
-            <w:vAlign w:val="center"/>
-          </w:tcPr>
-          <w:p>
-            <w:pPr>
-              <w:rPr>
-                <w:rFonts w:ascii="Arial" w:hAnsi="Arial" w:cs="Arial"/>
-                <w:b/>
-                <w:bCs/>
-              </w:rPr>
-            </w:pPr>
-            <w:r>
-              <w:rPr>
-                <w:rFonts w:ascii="Arial" w:hAnsi="Arial" w:cs="Arial"/>
-              </w:rPr>
-              <w:lastRenderedPageBreak/>
-              <w:t>LightGBM model misclassifying real players (False Positives)</w:t>
-            </w:r>
-          </w:p>
-        </w:tc>
-        <w:tc>
-          <w:tcPr>
-            <w:tcW w:w="3005" w:type="dxa"/>
-            <w:vAlign w:val="center"/>
-          </w:tcPr>
-          <w:p>
-            <w:pPr>
-              <w:rPr>
-                <w:rFonts w:ascii="Arial" w:hAnsi="Arial" w:cs="Arial"/>
-                <w:b/>
-                <w:bCs/>
-              </w:rPr>
-            </w:pPr>
-            <w:r>
-              <w:rPr>
-                <w:rFonts w:ascii="Arial" w:hAnsi="Arial" w:cs="Arial"/>
-              </w:rPr>
-              <w:t>Medium</w:t>
-            </w:r>
-          </w:p>
-        </w:tc>
-        <w:tc>
-          <w:tcPr>
-            <w:tcW w:w="3005" w:type="dxa"/>
-            <w:vAlign w:val="center"/>
-          </w:tcPr>
-          <w:p>
-            <w:pPr>
-              <w:rPr>
-                <w:rFonts w:ascii="Arial" w:hAnsi="Arial" w:cs="Arial"/>
-                <w:b/>
-                <w:bCs/>
-              </w:rPr>
-            </w:pPr>
-            <w:r>
-              <w:rPr>
-                <w:rFonts w:ascii="Arial" w:hAnsi="Arial" w:cs="Arial"/>
-              </w:rPr>
-              <w:t>High</w:t>
-            </w:r>
-          </w:p>
-        </w:tc>
-      </w:tr>
-    </w:tbl>
-    <w:p>
-      <w:pPr>
-        <w:rPr>
-          <w:rFonts w:ascii="Arial" w:hAnsi="Arial" w:cs="Arial"/>
-          <w:b/>
-          <w:bCs/>
-        </w:rPr>
-      </w:pPr>
+    <w:p>
+      <w:pPr>
+        <w:rPr>
+          <w:rFonts w:ascii="Arial" w:hAnsi="Arial" w:cs="Arial"/>
+          <w:b/>
+          <w:bCs/>
+        </w:rPr>
+      </w:pPr>
+      <w:r>
+        <w:rPr>
+          <w:rFonts w:ascii="Arial" w:hAnsi="Arial" w:cs="Arial"/>
+          <w:b/>
+          <w:bCs/>
+        </w:rPr>
+        <w:drawing>
+          <wp:inline distT="0" distB="0" distL="0" distR="0" wp14:anchorId="0E5E899F" wp14:editId="3633BD85">
+            <wp:extent cx="5731510" cy="1821815"/>
+            <wp:effectExtent l="0" t="0" r="2540" b="6985"/>
+            <wp:docPr id="1716050182" name="Picture 1"/>
+            <wp:cNvGraphicFramePr>
+              <a:graphicFrameLocks xmlns:a="http://schemas.openxmlformats.org/drawingml/2006/main" noChangeAspect="1"/>
+            </wp:cNvGraphicFramePr>
+            <a:graphic xmlns:a="http://schemas.openxmlformats.org/drawingml/2006/main">
+              <a:graphicData uri="http://schemas.openxmlformats.org/drawingml/2006/picture">
+                <pic:pic xmlns:pic="http://schemas.openxmlformats.org/drawingml/2006/picture">
+                  <pic:nvPicPr>
+                    <pic:cNvPr id="1716050182" name=""/>
+                    <pic:cNvPicPr/>
+                  </pic:nvPicPr>
+                  <pic:blipFill>
+                    <a:blip r:embed="rId9"/>
+                    <a:stretch>
+                      <a:fillRect/>
+                    </a:stretch>
+                  </pic:blipFill>
+                  <pic:spPr>
+                    <a:xfrm>
+                      <a:off x="0" y="0"/>
+                      <a:ext cx="5731510" cy="1821815"/>
+                    </a:xfrm>
+                    <a:prstGeom prst="rect">
+                      <a:avLst/>
+                    </a:prstGeom>
+                  </pic:spPr>
+                </pic:pic>
+              </a:graphicData>
+            </a:graphic>
+          </wp:inline>
+        </w:drawing>
+      </w:r>
+    </w:p>
+    <w:p>
+      <w:pPr>
+        <w:rPr>
+          <w:rFonts w:ascii="Arial" w:hAnsi="Arial" w:cs="Arial"/>
+        </w:rPr>
+      </w:pPr>
+      <w:r>
+        <w:rPr>
+          <w:rFonts w:ascii="Arial" w:hAnsi="Arial" w:cs="Arial"/>
+          <w:b/>
+          <w:bCs/>
+        </w:rPr>
+        <w:tab/>
+      </w:r>
+      <w:r>
+        <w:rPr>
+          <w:rFonts w:ascii="Arial" w:hAnsi="Arial" w:cs="Arial"/>
+          <w:b/>
+          <w:bCs/>
+        </w:rPr>
+        <w:tab/>
+      </w:r>
+      <w:r>
+        <w:rPr>
+          <w:rFonts w:ascii="Arial" w:hAnsi="Arial" w:cs="Arial"/>
+          <w:b/>
+          <w:bCs/>
+        </w:rPr>
+        <w:tab/>
+      </w:r>
+      <w:r>
+        <w:rPr>
+          <w:rFonts w:ascii="Arial" w:hAnsi="Arial" w:cs="Arial"/>
+          <w:b/>
+          <w:bCs/>
+        </w:rPr>
+        <w:tab/>
+      </w:r>
+      <w:r>
+        <w:rPr>
+          <w:rFonts w:ascii="Arial" w:hAnsi="Arial" w:cs="Arial"/>
+        </w:rPr>
+        <w:t>Table 8.1: Risk Analysis</w:t>
+      </w:r>
     </w:p>
     <w:p>
       <w:pPr>
@@ -2871,6 +2229,7 @@
     </w:p>
     <w:p>
       <w:pPr>
+        <w:ind w:left="720"/>
         <w:rPr>
           <w:rFonts w:ascii="Arial" w:hAnsi="Arial" w:cs="Arial"/>
         </w:rPr>
@@ -3238,6 +2597,155 @@
     </w:lvl>
   </w:abstractNum>
   <w:abstractNum w:abstractNumId="2" w15:restartNumberingAfterBreak="0">
+    <w:nsid w:val="2C3F1E70"/>
+    <w:multiLevelType w:val="multilevel"/>
+    <w:tmpl w:val="DE1EC738"/>
+    <w:lvl w:ilvl="0">
+      <w:start w:val="1"/>
+      <w:numFmt w:val="bullet"/>
+      <w:lvlText w:val=""/>
+      <w:lvlJc w:val="left"/>
+      <w:pPr>
+        <w:tabs>
+          <w:tab w:val="num" w:pos="720"/>
+        </w:tabs>
+        <w:ind w:left="720" w:hanging="360"/>
+      </w:pPr>
+      <w:rPr>
+        <w:rFonts w:ascii="Symbol" w:hAnsi="Symbol" w:hint="default"/>
+        <w:sz w:val="20"/>
+      </w:rPr>
+    </w:lvl>
+    <w:lvl w:ilvl="1" w:tentative="1">
+      <w:start w:val="1"/>
+      <w:numFmt w:val="bullet"/>
+      <w:lvlText w:val="o"/>
+      <w:lvlJc w:val="left"/>
+      <w:pPr>
+        <w:tabs>
+          <w:tab w:val="num" w:pos="1440"/>
+        </w:tabs>
+        <w:ind w:left="1440" w:hanging="360"/>
+      </w:pPr>
+      <w:rPr>
+        <w:rFonts w:ascii="Courier New" w:hAnsi="Courier New" w:hint="default"/>
+        <w:sz w:val="20"/>
+      </w:rPr>
+    </w:lvl>
+    <w:lvl w:ilvl="2" w:tentative="1">
+      <w:start w:val="1"/>
+      <w:numFmt w:val="bullet"/>
+      <w:lvlText w:val=""/>
+      <w:lvlJc w:val="left"/>
+      <w:pPr>
+        <w:tabs>
+          <w:tab w:val="num" w:pos="2160"/>
+        </w:tabs>
+        <w:ind w:left="2160" w:hanging="360"/>
+      </w:pPr>
+      <w:rPr>
+        <w:rFonts w:ascii="Wingdings" w:hAnsi="Wingdings" w:hint="default"/>
+        <w:sz w:val="20"/>
+      </w:rPr>
+    </w:lvl>
+    <w:lvl w:ilvl="3" w:tentative="1">
+      <w:start w:val="1"/>
+      <w:numFmt w:val="bullet"/>
+      <w:lvlText w:val=""/>
+      <w:lvlJc w:val="left"/>
+      <w:pPr>
+        <w:tabs>
+          <w:tab w:val="num" w:pos="2880"/>
+        </w:tabs>
+        <w:ind w:left="2880" w:hanging="360"/>
+      </w:pPr>
+      <w:rPr>
+        <w:rFonts w:ascii="Wingdings" w:hAnsi="Wingdings" w:hint="default"/>
+        <w:sz w:val="20"/>
+      </w:rPr>
+    </w:lvl>
+    <w:lvl w:ilvl="4" w:tentative="1">
+      <w:start w:val="1"/>
+      <w:numFmt w:val="bullet"/>
+      <w:lvlText w:val=""/>
+      <w:lvlJc w:val="left"/>
+      <w:pPr>
+        <w:tabs>
+          <w:tab w:val="num" w:pos="3600"/>
+        </w:tabs>
+        <w:ind w:left="3600" w:hanging="360"/>
+      </w:pPr>
+      <w:rPr>
+        <w:rFonts w:ascii="Wingdings" w:hAnsi="Wingdings" w:hint="default"/>
+        <w:sz w:val="20"/>
+      </w:rPr>
+    </w:lvl>
+    <w:lvl w:ilvl="5" w:tentative="1">
+      <w:start w:val="1"/>
+      <w:numFmt w:val="bullet"/>
+      <w:lvlText w:val=""/>
+      <w:lvlJc w:val="left"/>
+      <w:pPr>
+        <w:tabs>
+          <w:tab w:val="num" w:pos="4320"/>
+        </w:tabs>
+        <w:ind w:left="4320" w:hanging="360"/>
+      </w:pPr>
+      <w:rPr>
+        <w:rFonts w:ascii="Wingdings" w:hAnsi="Wingdings" w:hint="default"/>
+        <w:sz w:val="20"/>
+      </w:rPr>
+    </w:lvl>
+    <w:lvl w:ilvl="6" w:tentative="1">
+      <w:start w:val="1"/>
+      <w:numFmt w:val="bullet"/>
+      <w:lvlText w:val=""/>
+      <w:lvlJc w:val="left"/>
+      <w:pPr>
+        <w:tabs>
+          <w:tab w:val="num" w:pos="5040"/>
+        </w:tabs>
+        <w:ind w:left="5040" w:hanging="360"/>
+      </w:pPr>
+      <w:rPr>
+        <w:rFonts w:ascii="Wingdings" w:hAnsi="Wingdings" w:hint="default"/>
+        <w:sz w:val="20"/>
+      </w:rPr>
+    </w:lvl>
+    <w:lvl w:ilvl="7" w:tentative="1">
+      <w:start w:val="1"/>
+      <w:numFmt w:val="bullet"/>
+      <w:lvlText w:val=""/>
+      <w:lvlJc w:val="left"/>
+      <w:pPr>
+        <w:tabs>
+          <w:tab w:val="num" w:pos="5760"/>
+        </w:tabs>
+        <w:ind w:left="5760" w:hanging="360"/>
+      </w:pPr>
+      <w:rPr>
+        <w:rFonts w:ascii="Wingdings" w:hAnsi="Wingdings" w:hint="default"/>
+        <w:sz w:val="20"/>
+      </w:rPr>
+    </w:lvl>
+    <w:lvl w:ilvl="8" w:tentative="1">
+      <w:start w:val="1"/>
+      <w:numFmt w:val="bullet"/>
+      <w:lvlText w:val=""/>
+      <w:lvlJc w:val="left"/>
+      <w:pPr>
+        <w:tabs>
+          <w:tab w:val="num" w:pos="6480"/>
+        </w:tabs>
+        <w:ind w:left="6480" w:hanging="360"/>
+      </w:pPr>
+      <w:rPr>
+        <w:rFonts w:ascii="Wingdings" w:hAnsi="Wingdings" w:hint="default"/>
+        <w:sz w:val="20"/>
+      </w:rPr>
+    </w:lvl>
+  </w:abstractNum>
+  <w:abstractNum w:abstractNumId="3" w15:restartNumberingAfterBreak="0">
     <w:nsid w:val="2C5B5764"/>
     <w:multiLevelType w:val="hybridMultilevel"/>
     <w:tmpl w:val="29368A96"/>
@@ -3349,10 +2857,10 @@
       </w:rPr>
     </w:lvl>
   </w:abstractNum>
-  <w:abstractNum w:abstractNumId="3" w15:restartNumberingAfterBreak="0">
+  <w:abstractNum w:abstractNumId="4" w15:restartNumberingAfterBreak="0">
     <w:nsid w:val="2F6A32A7"/>
     <w:multiLevelType w:val="multilevel"/>
-    <w:tmpl w:val="DE1EC738"/>
+    <w:tmpl w:val="B1C0C942"/>
     <w:lvl w:ilvl="0">
       <w:start w:val="1"/>
       <w:numFmt w:val="bullet"/>
@@ -3366,7 +2874,8 @@
       </w:pPr>
       <w:rPr>
         <w:rFonts w:ascii="Symbol" w:hAnsi="Symbol" w:hint="default"/>
-        <w:sz w:val="20"/>
+        <w:sz w:val="22"/>
+        <w:szCs w:val="24"/>
       </w:rPr>
     </w:lvl>
     <w:lvl w:ilvl="1" w:tentative="1">
@@ -3498,7 +3007,7 @@
       </w:rPr>
     </w:lvl>
   </w:abstractNum>
-  <w:abstractNum w:abstractNumId="4" w15:restartNumberingAfterBreak="0">
+  <w:abstractNum w:abstractNumId="5" w15:restartNumberingAfterBreak="0">
     <w:nsid w:val="31706235"/>
     <w:multiLevelType w:val="multilevel"/>
     <w:tmpl w:val="A4FC09EE"/>
@@ -3647,7 +3156,7 @@
       </w:rPr>
     </w:lvl>
   </w:abstractNum>
-  <w:abstractNum w:abstractNumId="5" w15:restartNumberingAfterBreak="0">
+  <w:abstractNum w:abstractNumId="6" w15:restartNumberingAfterBreak="0">
     <w:nsid w:val="3F376025"/>
     <w:multiLevelType w:val="multilevel"/>
     <w:tmpl w:val="4CE69DEA"/>
@@ -3796,7 +3305,7 @@
       </w:rPr>
     </w:lvl>
   </w:abstractNum>
-  <w:abstractNum w:abstractNumId="6" w15:restartNumberingAfterBreak="0">
+  <w:abstractNum w:abstractNumId="7" w15:restartNumberingAfterBreak="0">
     <w:nsid w:val="670F6DAE"/>
     <w:multiLevelType w:val="multilevel"/>
     <w:tmpl w:val="FF144150"/>
@@ -3945,7 +3454,7 @@
       </w:rPr>
     </w:lvl>
   </w:abstractNum>
-  <w:abstractNum w:abstractNumId="7" w15:restartNumberingAfterBreak="0">
+  <w:abstractNum w:abstractNumId="8" w15:restartNumberingAfterBreak="0">
     <w:nsid w:val="68A677A0"/>
     <w:multiLevelType w:val="multilevel"/>
     <w:tmpl w:val="28F6D4BA"/>
@@ -4094,7 +3603,7 @@
       </w:rPr>
     </w:lvl>
   </w:abstractNum>
-  <w:abstractNum w:abstractNumId="8" w15:restartNumberingAfterBreak="0">
+  <w:abstractNum w:abstractNumId="9" w15:restartNumberingAfterBreak="0">
     <w:nsid w:val="6A797378"/>
     <w:multiLevelType w:val="multilevel"/>
     <w:tmpl w:val="43DE0568"/>
@@ -4244,30 +3753,33 @@
     </w:lvl>
   </w:abstractNum>
   <w:num w:numId="1" w16cid:durableId="484322432">
-    <w:abstractNumId w:val="3"/>
+    <w:abstractNumId w:val="4"/>
   </w:num>
   <w:num w:numId="2" w16cid:durableId="137917867">
-    <w:abstractNumId w:val="6"/>
+    <w:abstractNumId w:val="7"/>
   </w:num>
   <w:num w:numId="3" w16cid:durableId="1622109845">
-    <w:abstractNumId w:val="8"/>
+    <w:abstractNumId w:val="9"/>
   </w:num>
   <w:num w:numId="4" w16cid:durableId="755132060">
     <w:abstractNumId w:val="0"/>
   </w:num>
   <w:num w:numId="5" w16cid:durableId="1138377653">
+    <w:abstractNumId w:val="6"/>
+  </w:num>
+  <w:num w:numId="6" w16cid:durableId="947733222">
     <w:abstractNumId w:val="5"/>
   </w:num>
-  <w:num w:numId="6" w16cid:durableId="947733222">
-    <w:abstractNumId w:val="4"/>
-  </w:num>
   <w:num w:numId="7" w16cid:durableId="823931797">
-    <w:abstractNumId w:val="7"/>
+    <w:abstractNumId w:val="8"/>
   </w:num>
   <w:num w:numId="8" w16cid:durableId="1480030688">
     <w:abstractNumId w:val="1"/>
   </w:num>
   <w:num w:numId="9" w16cid:durableId="222721288">
+    <w:abstractNumId w:val="3"/>
+  </w:num>
+  <w:num w:numId="10" w16cid:durableId="1974867948">
     <w:abstractNumId w:val="2"/>
   </w:num>
 </w:numbering>
@@ -4876,7 +4388,6 @@
   <w:style w:type="character" w:default="1" w:styleId="DefaultParagraphFont">
     <w:name w:val="Default Paragraph Font"/>
     <w:uiPriority w:val="1"/>
-    <w:semiHidden/>
     <w:unhideWhenUsed/>
   </w:style>
   <w:style w:type="table" w:default="1" w:styleId="TableNormal">
@@ -5209,6 +4720,24 @@
       </w:tblBorders>
     </w:tblPr>
   </w:style>
+  <w:style w:type="paragraph" w:styleId="NormalWeb">
+    <w:name w:val="Normal (Web)"/>
+    <w:basedOn w:val="Normal"/>
+    <w:uiPriority w:val="99"/>
+    <w:unhideWhenUsed/>
+    <w:rsid w:val="00F26CC2"/>
+    <w:pPr>
+      <w:spacing w:before="100" w:beforeAutospacing="1" w:after="100" w:afterAutospacing="1" w:line="240" w:lineRule="auto"/>
+    </w:pPr>
+    <w:rPr>
+      <w:rFonts w:ascii="Times New Roman" w:eastAsia="Times New Roman" w:hAnsi="Times New Roman" w:cs="Times New Roman"/>
+      <w:kern w:val="0"/>
+      <w:sz w:val="24"/>
+      <w:szCs w:val="24"/>
+      <w:lang w:eastAsia="en-IN"/>
+      <w14:ligatures w14:val="none"/>
+    </w:rPr>
+  </w:style>
 </w:styles>
 </file>
 

</xml_diff>